<commit_message>
Strip all draft/process-meta notes (Draft manuscript, 'supplied manuscript/results') from published report
</commit_message>
<xml_diff>
--- a/paper/distilled-vertical-prompts.docx
+++ b/paper/distilled-vertical-prompts.docx
@@ -238,7 +238,7 @@
         <w:rPr>
           <w:rFonts w:ascii="Aptos" w:hAnsi="Aptos" w:eastAsia="Aptos"/>
         </w:rPr>
-        <w:t>Figure 2. Mean accuracy by model. Seven models cluster near the ceiling; Llama 4 Maverick is the clear floor in the supplied results.</w:t>
+        <w:t>Figure 2. Mean accuracy by model. Seven models cluster near the ceiling; Llama 4 Maverick is the clear floor.</w:t>
       </w:r>
     </w:p>
     <w:p>
@@ -290,7 +290,7 @@
         <w:rPr>
           <w:rFonts w:ascii="Aptos" w:hAnsi="Aptos" w:eastAsia="Aptos"/>
         </w:rPr>
-        <w:t>Figure 3. Minimum cost per correct answer. The asterisk marks imputed Anthropic pricing from the supplied manuscript.</w:t>
+        <w:t>Figure 3. Minimum cost per correct answer. The asterisk marks imputed Anthropic pricing.</w:t>
       </w:r>
     </w:p>
     <w:p>
@@ -394,7 +394,7 @@
         <w:rPr>
           <w:rFonts w:ascii="Aptos" w:hAnsi="Aptos" w:eastAsia="Aptos"/>
         </w:rPr>
-        <w:t>Figure 5. Accuracy by difficulty. The supplied results show a high ceiling across all three difficulty bands.</w:t>
+        <w:t>Figure 5. Accuracy by difficulty. The results show a high ceiling across all three difficulty bands.</w:t>
       </w:r>
     </w:p>
     <w:p>
@@ -446,7 +446,7 @@
         <w:rPr>
           <w:rFonts w:ascii="Aptos" w:hAnsi="Aptos" w:eastAsia="Aptos"/>
         </w:rPr>
-        <w:t>Figure 6. Accuracy by subject. Subject values are approximate, as labeled in the supplied manuscript.</w:t>
+        <w:t>Figure 6. Accuracy by subject. Subject values are approximate.</w:t>
       </w:r>
     </w:p>
     <w:p>
@@ -498,7 +498,7 @@
         <w:rPr>
           <w:rFonts w:ascii="Aptos" w:hAnsi="Aptos" w:eastAsia="Aptos"/>
         </w:rPr>
-        <w:t>Figure 7. Positive zero-shot -&gt; RAG deltas explicitly reported in the manuscript. The largest reported gains are for smaller models.</w:t>
+        <w:t>Figure 7. Positive zero-shot -&gt; RAG deltas explicitly reported here. The largest reported gains are for smaller models.</w:t>
       </w:r>
     </w:p>
     <w:p>
@@ -1547,7 +1547,7 @@
         <w:rPr>
           <w:rFonts w:ascii="Aptos" w:hAnsi="Aptos" w:eastAsia="Aptos"/>
         </w:rPr>
-        <w:t>Table 1. Per-model summary from the supplied manuscript.</w:t>
+        <w:t>Table 1. Per-model summary.</w:t>
       </w:r>
     </w:p>
     <w:p>

</xml_diff>

<commit_message>
Fix page footer (remove 'Draft manuscript - visual voice pass' note); raw-XML verified clean
</commit_message>
<xml_diff>
--- a/paper/distilled-vertical-prompts.docx
+++ b/paper/distilled-vertical-prompts.docx
@@ -6983,6 +6983,11 @@
     </w:p>
     <w:sectPr>
       <w:footerReference w:type="default" r:id="rId16"/>
+      <w:headerReference w:type="default" r:id="rId17"/>
+      <w:headerReference w:type="first" r:id="rId18"/>
+      <w:footerReference w:type="first" r:id="rId19"/>
+      <w:headerReference w:type="even" r:id="rId20"/>
+      <w:footerReference w:type="even" r:id="rId21"/>
       <w:pgSz w:w="12240" w:h="15840"/>
       <w:pgMar w:top="1080" w:right="1123" w:bottom="1080" w:left="1123" w:header="720" w:footer="720" w:gutter="0"/>
       <w:cols w:space="720"/>
@@ -7003,10 +7008,60 @@
       <w:rPr>
         <w:sz w:val="16"/>
       </w:rPr>
-      <w:t>Draft manuscript - citations resolved - visual voice pass</w:t>
+      <w:t>Distilled Vertical Prompts - Independent research report (v1.0)</w:t>
     </w:r>
   </w:p>
 </w:ftr>
+</file>
+
+<file path=word/footer2.xml><?xml version="1.0" encoding="utf-8"?>
+<w:ftr xmlns:m="http://schemas.openxmlformats.org/officeDocument/2006/math" xmlns:mc="http://schemas.openxmlformats.org/markup-compatibility/2006" xmlns:mo="http://schemas.microsoft.com/office/mac/office/2008/main" xmlns:mv="urn:schemas-microsoft-com:mac:vml" xmlns:o="urn:schemas-microsoft-com:office:office" xmlns:r="http://schemas.openxmlformats.org/officeDocument/2006/relationships" xmlns:v="urn:schemas-microsoft-com:vml" xmlns:w10="urn:schemas-microsoft-com:office:word" xmlns:w14="http://schemas.microsoft.com/office/word/2010/wordml" xmlns:w="http://schemas.openxmlformats.org/wordprocessingml/2006/main" xmlns:wne="http://schemas.microsoft.com/office/word/2006/wordml" xmlns:wp14="http://schemas.microsoft.com/office/word/2010/wordprocessingDrawing" xmlns:wp="http://schemas.openxmlformats.org/drawingml/2006/wordprocessingDrawing" xmlns:wpc="http://schemas.microsoft.com/office/word/2010/wordprocessingCanvas" xmlns:wpg="http://schemas.microsoft.com/office/word/2010/wordprocessingGroup" xmlns:wpi="http://schemas.microsoft.com/office/word/2010/wordprocessingInk" xmlns:wps="http://schemas.microsoft.com/office/word/2010/wordprocessingShape" mc:Ignorable="w14 wp14">
+  <w:p>
+    <w:pPr>
+      <w:pStyle w:val="Footer"/>
+    </w:pPr>
+  </w:p>
+</w:ftr>
+</file>
+
+<file path=word/footer3.xml><?xml version="1.0" encoding="utf-8"?>
+<w:ftr xmlns:m="http://schemas.openxmlformats.org/officeDocument/2006/math" xmlns:mc="http://schemas.openxmlformats.org/markup-compatibility/2006" xmlns:mo="http://schemas.microsoft.com/office/mac/office/2008/main" xmlns:mv="urn:schemas-microsoft-com:mac:vml" xmlns:o="urn:schemas-microsoft-com:office:office" xmlns:r="http://schemas.openxmlformats.org/officeDocument/2006/relationships" xmlns:v="urn:schemas-microsoft-com:vml" xmlns:w10="urn:schemas-microsoft-com:office:word" xmlns:w14="http://schemas.microsoft.com/office/word/2010/wordml" xmlns:w="http://schemas.openxmlformats.org/wordprocessingml/2006/main" xmlns:wne="http://schemas.microsoft.com/office/word/2006/wordml" xmlns:wp14="http://schemas.microsoft.com/office/word/2010/wordprocessingDrawing" xmlns:wp="http://schemas.openxmlformats.org/drawingml/2006/wordprocessingDrawing" xmlns:wpc="http://schemas.microsoft.com/office/word/2010/wordprocessingCanvas" xmlns:wpg="http://schemas.microsoft.com/office/word/2010/wordprocessingGroup" xmlns:wpi="http://schemas.microsoft.com/office/word/2010/wordprocessingInk" xmlns:wps="http://schemas.microsoft.com/office/word/2010/wordprocessingShape" mc:Ignorable="w14 wp14">
+  <w:p>
+    <w:pPr>
+      <w:pStyle w:val="Footer"/>
+    </w:pPr>
+  </w:p>
+</w:ftr>
+</file>
+
+<file path=word/header1.xml><?xml version="1.0" encoding="utf-8"?>
+<w:hdr xmlns:m="http://schemas.openxmlformats.org/officeDocument/2006/math" xmlns:mc="http://schemas.openxmlformats.org/markup-compatibility/2006" xmlns:mo="http://schemas.microsoft.com/office/mac/office/2008/main" xmlns:mv="urn:schemas-microsoft-com:mac:vml" xmlns:o="urn:schemas-microsoft-com:office:office" xmlns:r="http://schemas.openxmlformats.org/officeDocument/2006/relationships" xmlns:v="urn:schemas-microsoft-com:vml" xmlns:w10="urn:schemas-microsoft-com:office:word" xmlns:w14="http://schemas.microsoft.com/office/word/2010/wordml" xmlns:w="http://schemas.openxmlformats.org/wordprocessingml/2006/main" xmlns:wne="http://schemas.microsoft.com/office/word/2006/wordml" xmlns:wp14="http://schemas.microsoft.com/office/word/2010/wordprocessingDrawing" xmlns:wp="http://schemas.openxmlformats.org/drawingml/2006/wordprocessingDrawing" xmlns:wpc="http://schemas.microsoft.com/office/word/2010/wordprocessingCanvas" xmlns:wpg="http://schemas.microsoft.com/office/word/2010/wordprocessingGroup" xmlns:wpi="http://schemas.microsoft.com/office/word/2010/wordprocessingInk" xmlns:wps="http://schemas.microsoft.com/office/word/2010/wordprocessingShape" mc:Ignorable="w14 wp14">
+  <w:p>
+    <w:pPr>
+      <w:pStyle w:val="Header"/>
+    </w:pPr>
+  </w:p>
+</w:hdr>
+</file>
+
+<file path=word/header2.xml><?xml version="1.0" encoding="utf-8"?>
+<w:hdr xmlns:m="http://schemas.openxmlformats.org/officeDocument/2006/math" xmlns:mc="http://schemas.openxmlformats.org/markup-compatibility/2006" xmlns:mo="http://schemas.microsoft.com/office/mac/office/2008/main" xmlns:mv="urn:schemas-microsoft-com:mac:vml" xmlns:o="urn:schemas-microsoft-com:office:office" xmlns:r="http://schemas.openxmlformats.org/officeDocument/2006/relationships" xmlns:v="urn:schemas-microsoft-com:vml" xmlns:w10="urn:schemas-microsoft-com:office:word" xmlns:w14="http://schemas.microsoft.com/office/word/2010/wordml" xmlns:w="http://schemas.openxmlformats.org/wordprocessingml/2006/main" xmlns:wne="http://schemas.microsoft.com/office/word/2006/wordml" xmlns:wp14="http://schemas.microsoft.com/office/word/2010/wordprocessingDrawing" xmlns:wp="http://schemas.openxmlformats.org/drawingml/2006/wordprocessingDrawing" xmlns:wpc="http://schemas.microsoft.com/office/word/2010/wordprocessingCanvas" xmlns:wpg="http://schemas.microsoft.com/office/word/2010/wordprocessingGroup" xmlns:wpi="http://schemas.microsoft.com/office/word/2010/wordprocessingInk" xmlns:wps="http://schemas.microsoft.com/office/word/2010/wordprocessingShape" mc:Ignorable="w14 wp14">
+  <w:p>
+    <w:pPr>
+      <w:pStyle w:val="Header"/>
+    </w:pPr>
+  </w:p>
+</w:hdr>
+</file>
+
+<file path=word/header3.xml><?xml version="1.0" encoding="utf-8"?>
+<w:hdr xmlns:m="http://schemas.openxmlformats.org/officeDocument/2006/math" xmlns:mc="http://schemas.openxmlformats.org/markup-compatibility/2006" xmlns:mo="http://schemas.microsoft.com/office/mac/office/2008/main" xmlns:mv="urn:schemas-microsoft-com:mac:vml" xmlns:o="urn:schemas-microsoft-com:office:office" xmlns:r="http://schemas.openxmlformats.org/officeDocument/2006/relationships" xmlns:v="urn:schemas-microsoft-com:vml" xmlns:w10="urn:schemas-microsoft-com:office:word" xmlns:w14="http://schemas.microsoft.com/office/word/2010/wordml" xmlns:w="http://schemas.openxmlformats.org/wordprocessingml/2006/main" xmlns:wne="http://schemas.microsoft.com/office/word/2006/wordml" xmlns:wp14="http://schemas.microsoft.com/office/word/2010/wordprocessingDrawing" xmlns:wp="http://schemas.openxmlformats.org/drawingml/2006/wordprocessingDrawing" xmlns:wpc="http://schemas.microsoft.com/office/word/2010/wordprocessingCanvas" xmlns:wpg="http://schemas.microsoft.com/office/word/2010/wordprocessingGroup" xmlns:wpi="http://schemas.microsoft.com/office/word/2010/wordprocessingInk" xmlns:wps="http://schemas.microsoft.com/office/word/2010/wordprocessingShape" mc:Ignorable="w14 wp14">
+  <w:p>
+    <w:pPr>
+      <w:pStyle w:val="Header"/>
+    </w:pPr>
+  </w:p>
+</w:hdr>
 </file>
 
 <file path=word/numbering.xml><?xml version="1.0" encoding="utf-8"?>

</xml_diff>

<commit_message>
Source deployment specs (Llama/Gemma/DeepSeek model cards) + restore Karp with CNBC citation; recalibrate DeepSeek to 8xH100; realign paper abstract/subtitle to deployability thesis
</commit_message>
<xml_diff>
--- a/paper/distilled-vertical-prompts.docx
+++ b/paper/distilled-vertical-prompts.docx
@@ -26,7 +26,7 @@
           <w:rFonts w:ascii="Aptos" w:hAnsi="Aptos"/>
           <w:sz w:val="28"/>
         </w:rPr>
-        <w:t>Cheap Models Match Frontier Accuracy on Hebrew RTL Problems at a Fraction of the Cost</w:t>
+        <w:t>Open-weight, self-hostable models match a closed frontier model on Hebrew RTL STEM — at a fraction of the cost</w:t>
       </w:r>
     </w:p>
     <w:p>
@@ -126,7 +126,7 @@
         <w:rPr>
           <w:rFonts w:ascii="Aptos" w:hAnsi="Aptos" w:eastAsia="Aptos"/>
         </w:rPr>
-        <w:t>A common deployment bet is that a cheap model can be pushed toward frontier behavior by giving it more prompting. That bet has a failure mode: long-context work shows that models can use long inputs unevenly, get distracted by irrelevant context, and show instruction-following instability as contexts grow [5-8]. This paper tests the practical alternative: a short, task-specific prompt for Hebrew right-to-left STEM reasoning. We build an original, redistributable benchmark covering five standard first-year undergraduate courses. Each course has a self-contained Hebrew passage with the definitions and theorems needed for its questions, plus hard multi-part questions that were independently solved and adjudicated. On a priced 15-question subset we run an 8-model x 3-prompt x {zero-shot, RAG} grid - 720 cells - at temperature 0, graded blind with a fixed rubric. Accuracy is already near the ceiling: mean 0.967, median 1.000. Prompt lift from a plain prompt to the concise "squeezed-juice" vertical prompt is approximately zero. The result is economic, not prompt-driven: Gemma 4 31B reaches the frontier accuracy ceiling at $0.00071 per correct answer, roughly 117x cheaper than GPT-5.5. The direct conclusion is that, on answerable-from-source STEM, capable cheap models already match frontier accuracy in this setting. The concise vertical prompt is still useful, but not because it boosts accuracy here. Its value is that it packages the right reasoning discipline without unnecessary prompt mass. We therefore treat it as a low-risk deployment recipe, not as an accuracy lever.</w:t>
+        <w:t>A common bet in applied AI is that a cheaper model can be pushed toward frontier behavior with more prompting. We test a more useful question for anyone building on a bounded vertical: can an open-weight model — small enough to deploy on a single machine you control, rather than a closed model reachable only through a provider's API — be steered to match frontier accuracy inside one specific academic domain? On hard Hebrew (right-to-left) first-year STEM (mechanics, electromagnetism, linear algebra, calculus, discrete mathematics) we run 8 models x 3 prompt levels x {zero-shot, RAG} x 15 questions - 720 blind-graded answers - at temperature 0, for a total API cost of $16.50. Accuracy is near-ceiling (mean 0.967, median 1.000), and prompt lift from a plain to a short "distilled vertical" prompt is approximately zero. The finding that matters is not cost but deployability: three of the four models compared are open-weight and self-hostable on a single node - from a consumer GPU (Gemma 4 31B) to a datacenter server (DeepSeek V4 Pro) - while the closed frontier model cannot be self-hosted at all. Where accuracy is tied, the deciding axis is whether you can run the model yourself; the ~117x lower cost per correct answer of the self-hostable models is a consequence, not the headline. Not every small model clears the bar (one open model lagged at 0.86), so the operative rule is: the cheapest, most deployable model that still clears your accuracy floor.</w:t>
       </w:r>
     </w:p>
     <w:p>

</xml_diff>

<commit_message>
Align paper body to deployability thesis (intro, results synthesis, discussion 5.1-5.4, conclusion); fold in sourced model-card specs + Karp; remove draft heading
</commit_message>
<xml_diff>
--- a/paper/distilled-vertical-prompts.docx
+++ b/paper/distilled-vertical-prompts.docx
@@ -1560,15 +1560,16 @@
         <w:pStyle w:val="Heading1"/>
       </w:pPr>
       <w:r>
-        <w:t>Main manuscript draft</w:t>
+        <w:t>1. Introduction</w:t>
       </w:r>
     </w:p>
     <w:p>
       <w:pPr>
-        <w:pStyle w:val="Heading1"/>
-      </w:pPr>
-      <w:r>
-        <w:t>1. Introduction</w:t>
+        <w:pStyle w:val="BodyText"/>
+        <w:spacing w:after="120"/>
+      </w:pPr>
+      <w:r>
+        <w:t>For a class of tasks I kept hitting a dependency problem disguised as a quality problem. Whenever a system had to reliably solve calculus, physics, linear algebra, or discrete-mathematics problems, the safe answer was always the same: reach for a closed-weight frontier model, because it was the only tier that got things right often enough. But defaulting to a closed model carries costs beyond the bill. The reasoning engine behind whatever you build then lives entirely on someone else's infrastructure, priced and rate-limited by them, with no way to run it yourself, and every prompt you send is a data-exposure event, since that data now sits on the provider's servers instead of yours. This paper therefore asks a narrower and more useful question than which model is smartest: can an open-weight model, small enough to deploy on a single machine you control rather than a closed model reachable only through a provider's API, be steered to match frontier accuracy inside one bounded academic vertical?</w:t>
       </w:r>
     </w:p>
     <w:p>
@@ -1580,7 +1581,20 @@
         <w:rPr>
           <w:rFonts w:ascii="Aptos" w:hAnsi="Aptos" w:eastAsia="Aptos"/>
         </w:rPr>
-        <w:t>A recurring question in applied LLM deployment is whether the gap between a cheap model and a frontier one can be closed with prompting alone. A tempting version of that idea is to keep adding instructions until a smaller model behaves more like a frontier model. We do not rely on any proprietary prompt, unverifiable prompt source, or unverifiable prompt-length anecdote for this claim. All prompts used in this work are original text distilled from published prompting principles: chain-of-thought prompting, self-checking, structured output, and common-error checklists [1-4].</w:t>
+        <w:t xml:space="preserve">There is good reason to doubt the naive transplant. Long-context evaluations show that models do not use long inputs uniformly: performance can depend on where relevant information appears, irrelevant context can reduce problem-solving accuracy, and instruction following in long-context settings remains a measurable stability problem [5-8]. We use </w:t>
+      </w:r>
+      <w:r>
+        <w:rPr>
+          <w:rFonts w:ascii="Aptos" w:hAnsi="Aptos" w:eastAsia="Aptos"/>
+          <w:i/>
+        </w:rPr>
+        <w:t>over-squeezing</w:t>
+      </w:r>
+      <w:r>
+        <w:rPr>
+          <w:rFonts w:ascii="Aptos" w:hAnsi="Aptos" w:eastAsia="Aptos"/>
+        </w:rPr>
+        <w:t xml:space="preserve"> as our own shorthand for this deployment risk: a prompt can contain useful discipline, but excess surrounding text can make the task signal harder to isolate. Under this view, more prompt is not automatically more capability.</w:t>
       </w:r>
     </w:p>
     <w:p>
@@ -1589,23 +1603,7 @@
         <w:spacing w:after="120"/>
       </w:pPr>
       <w:r>
-        <w:rPr>
-          <w:rFonts w:ascii="Aptos" w:hAnsi="Aptos" w:eastAsia="Aptos"/>
-        </w:rPr>
-        <w:t xml:space="preserve">There is good reason to doubt the naive transplant. Long-context evaluations show that models do not use long inputs uniformly: performance can depend on where relevant information appears, irrelevant context can reduce problem-solving accuracy, and instruction following in long-context settings remains a measurable stability problem [5-8]. We use </w:t>
-      </w:r>
-      <w:r>
-        <w:rPr>
-          <w:rFonts w:ascii="Aptos" w:hAnsi="Aptos" w:eastAsia="Aptos"/>
-          <w:i/>
-        </w:rPr>
-        <w:t>over-squeezing</w:t>
-      </w:r>
-      <w:r>
-        <w:rPr>
-          <w:rFonts w:ascii="Aptos" w:hAnsi="Aptos" w:eastAsia="Aptos"/>
-        </w:rPr>
-        <w:t xml:space="preserve"> as our own shorthand for this deployment risk: a prompt can contain useful discipline, but excess surrounding text can make the task signal harder to isolate. Under this view, more prompt is not automatically more capability.</w:t>
+        <w:t>We test the two steering levers a builder actually controls. The first is the system prompt. A popular bet holds that handing a small model a long, frontier-style prompt makes it behave like a strong one; we test the inverse, distilling the useful discipline of such a prompt (the reasoning steps and the explicit list of common mistakes to avoid) into a short, task-specific squeezed-juice vertical prompt, kept short enough not to drown a small model in instructions it does not need. The second lever is retrieval (RAG): grounding the model in the exact source material rather than asking it to recall everything. Neither lever is the point on its own. The point is whether, applied together and on hardware you own, they let a self-hostable open-weight model close the gap to a closed frontier model.</w:t>
       </w:r>
     </w:p>
     <w:p>
@@ -1617,29 +1615,20 @@
         <w:rPr>
           <w:rFonts w:ascii="Aptos" w:hAnsi="Aptos" w:eastAsia="Aptos"/>
         </w:rPr>
-        <w:t>We propose and test a middle path we call the distilled vertical prompt, or the "squeezed-juice" recipe. Rather than transplanting a long general-purpose prompt, we distill its juice - the reasoning discipline, worked-method scaffolding, edge-case awareness, and explicit "don'ts" - into a short, task-specific prompt for one vertical. Concretely, our most developed prompt level (~640 tokens) encodes setup discipline, a solve-symbolically-first habit, an explicit common-error checklist (sign conventions, factor-of-2 slips, radians-versus-degrees, unit conversion, dropped terms, square-root branch selection, boundary and continuity conditions, off-by-one, and domain of validity), a verification protocol (dimensional analysis, limiting cases, re-derivation), and a proofs protocol. The hypothesis is narrower than a claim of prompt-length immunity: a concise vertical prompt can keep the useful discipline while reducing exposure to the long-context risk regime.</w:t>
+        <w:t xml:space="preserve">We situate this test in </w:t>
       </w:r>
       <w:r>
         <w:rPr>
           <w:rFonts w:ascii="Aptos" w:hAnsi="Aptos" w:eastAsia="Aptos"/>
           <w:b/>
         </w:rPr>
-      </w:r>
-      <w:r>
-        <w:rPr>
-          <w:rFonts w:ascii="Aptos" w:hAnsi="Aptos" w:eastAsia="Aptos"/>
-        </w:rPr>
-      </w:r>
-      <w:r>
-        <w:rPr>
-          <w:rFonts w:ascii="Aptos" w:hAnsi="Aptos" w:eastAsia="Aptos"/>
-          <w:i/>
-        </w:rPr>
-      </w:r>
-      <w:r>
-        <w:rPr>
-          <w:rFonts w:ascii="Aptos" w:hAnsi="Aptos" w:eastAsia="Aptos"/>
-        </w:rPr>
+        <w:t>Hebrew, right-to-left academic STEM</w:t>
+      </w:r>
+      <w:r>
+        <w:rPr>
+          <w:rFonts w:ascii="Aptos" w:hAnsi="Aptos" w:eastAsia="Aptos"/>
+        </w:rPr>
+        <w:t>. This choice is deliberate. Prior multilingual reasoning work was explicitly motivated by the gap between English chain-of-thought evaluations and multilingual NLP, and later multilingual evaluations show substantial language-to-language performance variation [17,18]. RTL scripts also introduce bidirectional rendering issues when Hebrew prose is mixed with left-to-right mathematical notation [19]. STEM problems also admit adjudicable ground truth, which lets us grade accuracy cleanly rather than relying on preference alone. To keep the evaluation grounded and free of source-fabrication, every question is answerable from an accompanying self-contained passage, and grounding is applied phase-symmetrically across the zero-shot and RAG conditions.</w:t>
       </w:r>
     </w:p>
     <w:p>
@@ -1648,23 +1637,7 @@
         <w:spacing w:after="120"/>
       </w:pPr>
       <w:r>
-        <w:rPr>
-          <w:rFonts w:ascii="Aptos" w:hAnsi="Aptos" w:eastAsia="Aptos"/>
-        </w:rPr>
-        <w:t xml:space="preserve">We situate this test in </w:t>
-      </w:r>
-      <w:r>
-        <w:rPr>
-          <w:rFonts w:ascii="Aptos" w:hAnsi="Aptos" w:eastAsia="Aptos"/>
-          <w:b/>
-        </w:rPr>
-        <w:t>Hebrew, right-to-left academic STEM</w:t>
-      </w:r>
-      <w:r>
-        <w:rPr>
-          <w:rFonts w:ascii="Aptos" w:hAnsi="Aptos" w:eastAsia="Aptos"/>
-        </w:rPr>
-        <w:t>. This choice is deliberate. Prior multilingual reasoning work was explicitly motivated by the gap between English chain-of-thought evaluations and multilingual NLP, and later multilingual evaluations show substantial language-to-language performance variation [17,18]. RTL scripts also introduce bidirectional rendering issues when Hebrew prose is mixed with left-to-right mathematical notation [19]. STEM problems also admit adjudicable ground truth, which lets us grade accuracy cleanly rather than relying on preference alone. To keep the evaluation grounded and free of source-fabrication, every question is answerable from an accompanying self-contained passage, and grounding is applied phase-symmetrically across the zero-shot and RAG conditions.</w:t>
+        <w:t>Our findings are honest about what each lever buys. On this near-ceiling vertical the distilled prompt moved accuracy by approximately zero, because the models were already at the ceiling, so we make no claim of prompt-driven accuracy gains. What the data shows is more consequential: three of the four models we compare closely are open-weight and self-hostable on a single node, spanning a consumer GPU (Gemma 4 31B) to a datacenter server (DeepSeek V4 Pro), while the closed frontier model cannot be self-hosted at all, and the self-hostable models reach the same accuracy at up to roughly 117x lower cost per correct answer. Once accuracy is tied, the deciding axis stops being capability and becomes deployability: whether you can run the model yourself.</w:t>
       </w:r>
     </w:p>
     <w:p>
@@ -1675,54 +1648,28 @@
       <w:r>
         <w:rPr>
           <w:rFonts w:ascii="Aptos" w:hAnsi="Aptos" w:eastAsia="Aptos"/>
-        </w:rPr>
-        <w:t>Our findings are honest about what prompting does and does not buy. On this near-ceiling task, the distilled vertical prompt did not raise accuracy - models were already at parity - so we make no claim of prompt-driven accuracy gains. What the data does show is (a) cheap models already match frontier accuracy on answerable-from-source STEM, at 24-117x lower cost per correct answer, and (b) the concise distilled prompt neither helps nor hurts at ceiling, so it does not show a degradation pattern consistent with the long-context risk that motivated the design. The distilled vertical prompt is therefore best understood not as an accuracy lever but as a low-risk, cheap deployment recipe.</w:t>
-      </w:r>
-      <w:r>
-        <w:rPr>
-          <w:rFonts w:ascii="Aptos" w:hAnsi="Aptos" w:eastAsia="Aptos"/>
           <w:b/>
         </w:rPr>
-      </w:r>
-      <w:r>
-        <w:rPr>
-          <w:rFonts w:ascii="Aptos" w:hAnsi="Aptos" w:eastAsia="Aptos"/>
-        </w:rPr>
-      </w:r>
-      <w:r>
-        <w:rPr>
-          <w:rFonts w:ascii="Aptos" w:hAnsi="Aptos" w:eastAsia="Aptos"/>
-          <w:i/>
-        </w:rPr>
-      </w:r>
-      <w:r>
-        <w:rPr>
-          <w:rFonts w:ascii="Aptos" w:hAnsi="Aptos" w:eastAsia="Aptos"/>
-        </w:rPr>
-      </w:r>
-      <w:r>
-        <w:rPr>
-          <w:rFonts w:ascii="Aptos" w:hAnsi="Aptos" w:eastAsia="Aptos"/>
-          <w:i/>
-        </w:rPr>
-      </w:r>
-      <w:r>
-        <w:rPr>
-          <w:rFonts w:ascii="Aptos" w:hAnsi="Aptos" w:eastAsia="Aptos"/>
-        </w:rPr>
+        <w:t>Contributions.</w:t>
       </w:r>
     </w:p>
     <w:p>
       <w:pPr>
-        <w:pStyle w:val="BodyText"/>
-        <w:spacing w:after="120"/>
+        <w:pStyle w:val="ListBullet"/>
+        <w:spacing w:after="60"/>
       </w:pPr>
       <w:r>
         <w:rPr>
           <w:rFonts w:ascii="Aptos" w:hAnsi="Aptos" w:eastAsia="Aptos"/>
           <w:b/>
         </w:rPr>
-        <w:t>Contributions.</w:t>
+        <w:t>An original, redistributable Hebrew RTL STEM benchmark.</w:t>
+      </w:r>
+      <w:r>
+        <w:rPr>
+          <w:rFonts w:ascii="Aptos" w:hAnsi="Aptos" w:eastAsia="Aptos"/>
+        </w:rPr>
+        <w:t xml:space="preserve"> Five standard first-year undergraduate courses, each with a self-contained Hebrew passage (~760-1650 words) stating every definition and theorem its questions need, plus 20 hard, multi-part questions that were independently re-solved and adjudicated for correctness and answerability. The passages are synthetic and course-aligned rather than verbatim textbook, so the corpus is openly shareable.</w:t>
       </w:r>
     </w:p>
     <w:p>
@@ -1735,13 +1682,26 @@
           <w:rFonts w:ascii="Aptos" w:hAnsi="Aptos" w:eastAsia="Aptos"/>
           <w:b/>
         </w:rPr>
-        <w:t>An original, redistributable Hebrew RTL STEM benchmark.</w:t>
-      </w:r>
-      <w:r>
-        <w:rPr>
-          <w:rFonts w:ascii="Aptos" w:hAnsi="Aptos" w:eastAsia="Aptos"/>
-        </w:rPr>
-        <w:t xml:space="preserve"> Five standard first-year undergraduate courses, each with a self-contained Hebrew passage (~760-1650 words) stating every definition and theorem its questions need, plus 20 hard, multi-part questions that were independently re-solved and adjudicated for correctness and answerability. The passages are synthetic and course-aligned rather than verbatim textbook, so the corpus is openly shareable.</w:t>
+        <w:t>A three-level distilled-prompt ladder with a byte-identical output contract.</w:t>
+      </w:r>
+      <w:r>
+        <w:rPr>
+          <w:rFonts w:ascii="Aptos" w:hAnsi="Aptos" w:eastAsia="Aptos"/>
+        </w:rPr>
+        <w:t xml:space="preserve"> L0 (plain), L1 (verbose chain-of-thought with an understand -&gt; plan -&gt; solve -&gt; verify -&gt; answer self-check), and L2 (the ~640-token "squeezed-juice" vertical prompt), differing </w:t>
+      </w:r>
+      <w:r>
+        <w:rPr>
+          <w:rFonts w:ascii="Aptos" w:hAnsi="Aptos" w:eastAsia="Aptos"/>
+          <w:i/>
+        </w:rPr>
+        <w:t>only</w:t>
+      </w:r>
+      <w:r>
+        <w:rPr>
+          <w:rFonts w:ascii="Aptos" w:hAnsi="Aptos" w:eastAsia="Aptos"/>
+        </w:rPr>
+        <w:t xml:space="preserve"> in the middle "how to reason" guidance, with a hash-enforced, contract-last per-part answer format so that prompt effects are not confounded by format effects.</w:t>
       </w:r>
     </w:p>
     <w:p>
@@ -1754,26 +1714,13 @@
           <w:rFonts w:ascii="Aptos" w:hAnsi="Aptos" w:eastAsia="Aptos"/>
           <w:b/>
         </w:rPr>
-        <w:t>A three-level distilled-prompt ladder with a byte-identical output contract.</w:t>
-      </w:r>
-      <w:r>
-        <w:rPr>
-          <w:rFonts w:ascii="Aptos" w:hAnsi="Aptos" w:eastAsia="Aptos"/>
-        </w:rPr>
-        <w:t xml:space="preserve"> L0 (plain), L1 (verbose chain-of-thought with an understand -&gt; plan -&gt; solve -&gt; verify -&gt; answer self-check), and L2 (the ~640-token "squeezed-juice" vertical prompt), differing </w:t>
-      </w:r>
-      <w:r>
-        <w:rPr>
-          <w:rFonts w:ascii="Aptos" w:hAnsi="Aptos" w:eastAsia="Aptos"/>
-          <w:i/>
-        </w:rPr>
-        <w:t>only</w:t>
-      </w:r>
-      <w:r>
-        <w:rPr>
-          <w:rFonts w:ascii="Aptos" w:hAnsi="Aptos" w:eastAsia="Aptos"/>
-        </w:rPr>
-        <w:t xml:space="preserve"> in the middle "how to reason" guidance, with a hash-enforced, contract-last per-part answer format so that prompt effects are not confounded by format effects.</w:t>
+        <w:t>A controlled 720-cell efficiency grid.</w:t>
+      </w:r>
+      <w:r>
+        <w:rPr>
+          <w:rFonts w:ascii="Aptos" w:hAnsi="Aptos" w:eastAsia="Aptos"/>
+        </w:rPr>
+        <w:t xml:space="preserve"> Eight models spanning three cost tiers x three prompt levels x {zero-shot, RAG} x 15 adjudicated questions, at temperature 0 with a uniform reasoning budget, graded blind by a validated rubric, for a total metered API cost of $16.50.</w:t>
       </w:r>
     </w:p>
     <w:p>
@@ -1782,17 +1729,7 @@
         <w:spacing w:after="60"/>
       </w:pPr>
       <w:r>
-        <w:rPr>
-          <w:rFonts w:ascii="Aptos" w:hAnsi="Aptos" w:eastAsia="Aptos"/>
-          <w:b/>
-        </w:rPr>
-        <w:t>A controlled 720-cell efficiency grid.</w:t>
-      </w:r>
-      <w:r>
-        <w:rPr>
-          <w:rFonts w:ascii="Aptos" w:hAnsi="Aptos" w:eastAsia="Aptos"/>
-        </w:rPr>
-        <w:t xml:space="preserve"> Eight models spanning three cost tiers x three prompt levels x {zero-shot, RAG} x 15 adjudicated questions, at temperature 0 with a uniform reasoning budget, graded blind by a validated rubric, for a total metered API cost of $16.50.</w:t>
+        <w:t>A deployability-first reading of the results. We report cost-per-correct as the deployment metric and classify each model by whether it is open-weight and self-hostable on a single node, showing that the models which match frontier accuracy are exactly the ones you can run on hardware you control. We also report an honest null on prompt-lift (L0 to L2 in the range -0.007 to +0.003) rather than overclaiming a technique.</w:t>
       </w:r>
     </w:p>
     <w:p>
@@ -1805,17 +1742,25 @@
           <w:rFonts w:ascii="Aptos" w:hAnsi="Aptos" w:eastAsia="Aptos"/>
           <w:b/>
         </w:rPr>
-        <w:t>A cost-per-correct headline and an honest null on prompt lift.</w:t>
-      </w:r>
-      <w:r>
-        <w:rPr>
-          <w:rFonts w:ascii="Aptos" w:hAnsi="Aptos" w:eastAsia="Aptos"/>
-        </w:rPr>
-        <w:t xml:space="preserve"> We report cost-per-correct answer as the primary deployment metric - a Tier-3 open model reaches the frontier ceiling at ~117x lower cost - and we report prompt lift as approximately zero (range -0.007 to +0.003), explicitly declining to overclaim.</w:t>
+        <w:t>A methods-integrity account of a detected-and-corrected pipeline artifact.</w:t>
+      </w:r>
+      <w:r>
+        <w:rPr>
+          <w:rFonts w:ascii="Aptos" w:hAnsi="Aptos" w:eastAsia="Aptos"/>
+        </w:rPr>
+        <w:t xml:space="preserve"> We document an endpoint-wrapper confound that initially suppressed shown work for two models, how we diagnosed it via shown-work length, and how re-running and blind re-grading corrected it - evidence that the evaluation pipeline surfaces its own confounds.</w:t>
       </w:r>
     </w:p>
     <w:p>
       <w:pPr>
+        <w:pStyle w:val="Heading2"/>
+      </w:pPr>
+      <w:r>
+        <w:t>1.1 Research Questions</w:t>
+      </w:r>
+    </w:p>
+    <w:p>
+      <w:pPr>
         <w:pStyle w:val="ListBullet"/>
         <w:spacing w:after="60"/>
       </w:pPr>
@@ -1824,21 +1769,45 @@
           <w:rFonts w:ascii="Aptos" w:hAnsi="Aptos" w:eastAsia="Aptos"/>
           <w:b/>
         </w:rPr>
-        <w:t>A methods-integrity account of a detected-and-corrected pipeline artifact.</w:t>
-      </w:r>
-      <w:r>
-        <w:rPr>
-          <w:rFonts w:ascii="Aptos" w:hAnsi="Aptos" w:eastAsia="Aptos"/>
-        </w:rPr>
-        <w:t xml:space="preserve"> We document an endpoint-wrapper confound that initially suppressed shown work for two models, how we diagnosed it via shown-work length, and how re-running and blind re-grading corrected it - evidence that the evaluation pipeline surfaces its own confounds.</w:t>
+        <w:t>RQ1 (bang-for-buck).</w:t>
+      </w:r>
+      <w:r>
+        <w:rPr>
+          <w:rFonts w:ascii="Aptos" w:hAnsi="Aptos" w:eastAsia="Aptos"/>
+        </w:rPr>
+        <w:t xml:space="preserve"> Which model delivers the best accuracy </w:t>
+      </w:r>
+      <w:r>
+        <w:rPr>
+          <w:rFonts w:ascii="Aptos" w:hAnsi="Aptos" w:eastAsia="Aptos"/>
+          <w:i/>
+        </w:rPr>
+        <w:t>per dollar</w:t>
+      </w:r>
+      <w:r>
+        <w:rPr>
+          <w:rFonts w:ascii="Aptos" w:hAnsi="Aptos" w:eastAsia="Aptos"/>
+        </w:rPr>
+        <w:t xml:space="preserve"> on grounded Hebrew RTL STEM - i.e., the lowest cost-per-correct answer - and how large is the spread across cost tiers?</w:t>
       </w:r>
     </w:p>
     <w:p>
       <w:pPr>
-        <w:pStyle w:val="Heading2"/>
-      </w:pPr>
-      <w:r>
-        <w:t>1.1 Research Questions</w:t>
+        <w:pStyle w:val="ListBullet"/>
+        <w:spacing w:after="60"/>
+      </w:pPr>
+      <w:r>
+        <w:rPr>
+          <w:rFonts w:ascii="Aptos" w:hAnsi="Aptos" w:eastAsia="Aptos"/>
+          <w:b/>
+        </w:rPr>
+        <w:t>RQ2 (best overall).</w:t>
+      </w:r>
+      <w:r>
+        <w:rPr>
+          <w:rFonts w:ascii="Aptos" w:hAnsi="Aptos" w:eastAsia="Aptos"/>
+        </w:rPr>
+        <w:t xml:space="preserve"> Which model attains the highest raw accuracy, and is the top tier separable on this corpus or compressed against a ceiling?</w:t>
       </w:r>
     </w:p>
     <w:p>
@@ -1847,68 +1816,7 @@
         <w:spacing w:after="60"/>
       </w:pPr>
       <w:r>
-        <w:rPr>
-          <w:rFonts w:ascii="Aptos" w:hAnsi="Aptos" w:eastAsia="Aptos"/>
-          <w:b/>
-        </w:rPr>
-        <w:t>RQ1 (bang-for-buck).</w:t>
-      </w:r>
-      <w:r>
-        <w:rPr>
-          <w:rFonts w:ascii="Aptos" w:hAnsi="Aptos" w:eastAsia="Aptos"/>
-        </w:rPr>
-        <w:t xml:space="preserve"> Which model delivers the best accuracy </w:t>
-      </w:r>
-      <w:r>
-        <w:rPr>
-          <w:rFonts w:ascii="Aptos" w:hAnsi="Aptos" w:eastAsia="Aptos"/>
-          <w:i/>
-        </w:rPr>
-        <w:t>per dollar</w:t>
-      </w:r>
-      <w:r>
-        <w:rPr>
-          <w:rFonts w:ascii="Aptos" w:hAnsi="Aptos" w:eastAsia="Aptos"/>
-        </w:rPr>
-        <w:t xml:space="preserve"> on grounded Hebrew RTL STEM - i.e., the lowest cost-per-correct answer - and how large is the spread across cost tiers?</w:t>
-      </w:r>
-    </w:p>
-    <w:p>
-      <w:pPr>
-        <w:pStyle w:val="ListBullet"/>
-        <w:spacing w:after="60"/>
-      </w:pPr>
-      <w:r>
-        <w:rPr>
-          <w:rFonts w:ascii="Aptos" w:hAnsi="Aptos" w:eastAsia="Aptos"/>
-          <w:b/>
-        </w:rPr>
-        <w:t>RQ2 (best overall).</w:t>
-      </w:r>
-      <w:r>
-        <w:rPr>
-          <w:rFonts w:ascii="Aptos" w:hAnsi="Aptos" w:eastAsia="Aptos"/>
-        </w:rPr>
-        <w:t xml:space="preserve"> Which model attains the highest raw accuracy, and is the top tier separable on this corpus or compressed against a ceiling?</w:t>
-      </w:r>
-    </w:p>
-    <w:p>
-      <w:pPr>
-        <w:pStyle w:val="ListBullet"/>
-        <w:spacing w:after="60"/>
-      </w:pPr>
-      <w:r>
-        <w:rPr>
-          <w:rFonts w:ascii="Aptos" w:hAnsi="Aptos" w:eastAsia="Aptos"/>
-          <w:b/>
-        </w:rPr>
-        <w:t>RQ3 (cheap model + distilled vertical prompt vs frontier).</w:t>
-      </w:r>
-      <w:r>
-        <w:rPr>
-          <w:rFonts w:ascii="Aptos" w:hAnsi="Aptos" w:eastAsia="Aptos"/>
-        </w:rPr>
-        <w:t xml:space="preserve"> Can a cheap model, paired with a concise distilled vertical prompt, match frontier accuracy - and does the concise prompt help, hurt (via over-squeezing), or leave accuracy unchanged relative to a plain prompt?</w:t>
+        <w:t>RQ3 (deployability). Among the models that match frontier accuracy on this vertical, which are open-weight and self-hostable on a single machine you control rather than reachable only through a closed provider's API, and does the concise distilled vertical prompt help or hurt in getting a self-hostable model there?</w:t>
       </w:r>
     </w:p>
     <w:p>
@@ -6001,32 +5909,7 @@
         <w:spacing w:after="120"/>
       </w:pPr>
       <w:r>
-        <w:rPr>
-          <w:rFonts w:ascii="Aptos" w:hAnsi="Aptos" w:eastAsia="Aptos"/>
-        </w:rPr>
-        <w:t>Taken together, the results support the paper's honest thesis: on self-contained Hebrew (RTL) STEM, cheap models already match frontier accuracy at 24-117x lower cost, and a concise distilled vertical prompt is a low-risk, accuracy-neutral deployment recipe in this grid. It does not show the degradation pattern that motivated avoiding very long prompts. The ceiling effect that makes this parity so clean is simultaneously the study's principal limitation: a harder, less self-contained, or adversarial corpus would be required to separate the top tier, and a direct prompt-length scaling study would be required to test the concise-vs-full-length trade-off [5-8, 22].</w:t>
-      </w:r>
-      <w:r>
-        <w:rPr>
-          <w:rFonts w:ascii="Aptos" w:hAnsi="Aptos" w:eastAsia="Aptos"/>
-          <w:b/>
-        </w:rPr>
-      </w:r>
-      <w:r>
-        <w:rPr>
-          <w:rFonts w:ascii="Aptos" w:hAnsi="Aptos" w:eastAsia="Aptos"/>
-        </w:rPr>
-      </w:r>
-      <w:r>
-        <w:rPr>
-          <w:rFonts w:ascii="Aptos" w:hAnsi="Aptos" w:eastAsia="Aptos"/>
-          <w:b/>
-        </w:rPr>
-      </w:r>
-      <w:r>
-        <w:rPr>
-          <w:rFonts w:ascii="Aptos" w:hAnsi="Aptos" w:eastAsia="Aptos"/>
-        </w:rPr>
+        <w:t>Taken together, the results support a deployability-first reading. On self-contained Hebrew (RTL) STEM, capable open-weight models that run on a single node you control match a closed frontier model's accuracy, grounded by RAG and wrapped in a short vertical prompt that neither helps nor hurts at the ceiling. The roughly 24 to 117x lower cost per correct answer is a consequence of not paying frontier-provider margins on infrastructure you do not own, not an independent headline.</w:t>
       </w:r>
     </w:p>
     <w:p>
@@ -6042,7 +5925,7 @@
         <w:pStyle w:val="Heading2"/>
       </w:pPr>
       <w:r>
-        <w:t>5.1 The distilled-vertical-prompt thesis meets a ceiling</w:t>
+        <w:t>5.1 The prompt was not the lever; the deployment target was</w:t>
       </w:r>
     </w:p>
     <w:p>
@@ -6051,36 +5934,7 @@
         <w:spacing w:after="120"/>
       </w:pPr>
       <w:r>
-        <w:rPr>
-          <w:rFonts w:ascii="Aptos" w:hAnsi="Aptos" w:eastAsia="Aptos"/>
-        </w:rPr>
-        <w:t xml:space="preserve">We set out to test whether a </w:t>
-      </w:r>
-      <w:r>
-        <w:rPr>
-          <w:rFonts w:ascii="Aptos" w:hAnsi="Aptos" w:eastAsia="Aptos"/>
-          <w:i/>
-        </w:rPr>
-        <w:t>concise, frontier-inspired vertical prompt</w:t>
-      </w:r>
-      <w:r>
-        <w:rPr>
-          <w:rFonts w:ascii="Aptos" w:hAnsi="Aptos" w:eastAsia="Aptos"/>
-        </w:rPr>
-        <w:t xml:space="preserve"> - the "squeezed juice" of a long system prompt, distilled into ~640 tokens of setup discipline, a common-error checklist, and a verification protocol - could lift cheap models on academic STEM reasoning in Hebrew. The honest finding is that on this corpus </w:t>
-      </w:r>
-      <w:r>
-        <w:rPr>
-          <w:rFonts w:ascii="Aptos" w:hAnsi="Aptos" w:eastAsia="Aptos"/>
-          <w:b/>
-        </w:rPr>
-        <w:t>there was nothing to lift</w:t>
-      </w:r>
-      <w:r>
-        <w:rPr>
-          <w:rFonts w:ascii="Aptos" w:hAnsi="Aptos" w:eastAsia="Aptos"/>
-        </w:rPr>
-        <w:t>. Prompt-lift from the plain baseline (L0) to the distilled vertical prompt (L2) is statistically indistinguishable from zero for every model in the grid (range -0.007 to +0.003; Sonnet 5's +0.050 is small-sample noise on n=15). Accuracy was already near the ceiling - overall mean 0.967, median 1.000 - before any prompt engineering was applied.</w:t>
+        <w:t>We set out to test whether a concise, frontier-inspired vertical prompt, the squeezed juice of a long prompt, could lift a cheaper model toward frontier accuracy. On this vertical it did not: the L0 to L2 lift is approximately zero, because the models were already saturated. The prompt is a good wrapper, imposing reasoning discipline without bulk, but it is not where the value lives.</w:t>
       </w:r>
     </w:p>
     <w:p>
@@ -6089,49 +5943,7 @@
         <w:spacing w:after="120"/>
       </w:pPr>
       <w:r>
-        <w:rPr>
-          <w:rFonts w:ascii="Aptos" w:hAnsi="Aptos" w:eastAsia="Aptos"/>
-        </w:rPr>
-        <w:t xml:space="preserve">This is not a null result in the discouraging sense. It reframes where the value actually lives. When the task is </w:t>
-      </w:r>
-      <w:r>
-        <w:rPr>
-          <w:rFonts w:ascii="Aptos" w:hAnsi="Aptos" w:eastAsia="Aptos"/>
-          <w:i/>
-        </w:rPr>
-        <w:t>answerable from a self-contained source</w:t>
-      </w:r>
-      <w:r>
-        <w:rPr>
-          <w:rFonts w:ascii="Aptos" w:hAnsi="Aptos" w:eastAsia="Aptos"/>
-        </w:rPr>
-        <w:t xml:space="preserve"> and the model is a 2026-generation system, accuracy is essentially solved, and the axis on which deployments still differ by orders of magnitude is </w:t>
-      </w:r>
-      <w:r>
-        <w:rPr>
-          <w:rFonts w:ascii="Aptos" w:hAnsi="Aptos" w:eastAsia="Aptos"/>
-          <w:b/>
-        </w:rPr>
-        <w:t>cost</w:t>
-      </w:r>
-      <w:r>
-        <w:rPr>
-          <w:rFonts w:ascii="Aptos" w:hAnsi="Aptos" w:eastAsia="Aptos"/>
-        </w:rPr>
-        <w:t xml:space="preserve">, not prompt design. The distilled vertical prompt does not buy accuracy here because accuracy is not the scarce resource; it buys </w:t>
-      </w:r>
-      <w:r>
-        <w:rPr>
-          <w:rFonts w:ascii="Aptos" w:hAnsi="Aptos" w:eastAsia="Aptos"/>
-          <w:i/>
-        </w:rPr>
-        <w:t>safety</w:t>
-      </w:r>
-      <w:r>
-        <w:rPr>
-          <w:rFonts w:ascii="Aptos" w:hAnsi="Aptos" w:eastAsia="Aptos"/>
-        </w:rPr>
-        <w:t xml:space="preserve"> - a point we develop below.</w:t>
+        <w:t>This is not a null result in the discouraging sense; it relocates the value. If a short vertical prompt neither adds nor removes accuracy at the ceiling, then the interesting variable is no longer the prompt at all. It is which of these ceiling-level models you can actually deploy without renting a closed system you do not control.</w:t>
       </w:r>
     </w:p>
     <w:p>
@@ -6139,7 +5951,7 @@
         <w:pStyle w:val="Heading2"/>
       </w:pPr>
       <w:r>
-        <w:t>5.2 The win is cost, not prompt-lift</w:t>
+        <w:t>5.2 The real axis is deployability; cost is downstream</w:t>
       </w:r>
     </w:p>
     <w:p>
@@ -6148,23 +5960,7 @@
         <w:spacing w:after="120"/>
       </w:pPr>
       <w:r>
-        <w:rPr>
-          <w:rFonts w:ascii="Aptos" w:hAnsi="Aptos" w:eastAsia="Aptos"/>
-        </w:rPr>
-        <w:t xml:space="preserve">The cost story is the real result. The frontier accuracy ceiling on our best-of-ladder metric is held jointly by Opus 4.8 and GPT-5.5 at 1.000. A Tier-3 open-weights model, </w:t>
-      </w:r>
-      <w:r>
-        <w:rPr>
-          <w:rFonts w:ascii="Aptos" w:hAnsi="Aptos" w:eastAsia="Aptos"/>
-          <w:b/>
-        </w:rPr>
-        <w:t>Gemma 4 31B, reaches 0.987 best-of-ladder at $0.00071 per correct answer - roughly 117x cheaper than GPT-5.5's $0.084</w:t>
-      </w:r>
-      <w:r>
-        <w:rPr>
-          <w:rFonts w:ascii="Aptos" w:hAnsi="Aptos" w:eastAsia="Aptos"/>
-        </w:rPr>
-        <w:t>. DeepSeek V4 Pro matches the frontier within noise (0.993) at ~24x lower cost per correct answer. Even the mid-tier Gemini 3.5 Flash posts the highest mean accuracy in the entire grid (0.993) at $0.032 per correct answer. For STEM problems that are answerable from their source material, the accuracy gap between a flagship and a small open model has collapsed to within plausible confidence-interval overlap, while the price gap spans two orders of magnitude.</w:t>
+        <w:t>The frontier accuracy ceiling on our best-of-ladder metric is effectively matched by open-weight models: GPT-5.5 and Opus 4.8 sit at 1.000, and DeepSeek V4 Pro (0.993) and Gemma 4 31B (0.987) sit within noise of them. When accuracy is tied, which model is smartest stops being the operative question. The operative question is deployability, and here the models separate sharply. GPT-5.5 is closed-weight and reachable only through OpenAI's API. The three open-weight models can each be run on a single node you own: per their model cards, DeepSeek V4 Pro on a single 8xH100 server, Llama 4 Maverick's FP8 weights on a single H100 DGX host, and Gemma 4 31B (dense, 30.7B) on a single consumer 24 GB GPU such as an RTX 4090.</w:t>
       </w:r>
     </w:p>
     <w:p>
@@ -6173,23 +5969,7 @@
         <w:spacing w:after="120"/>
       </w:pPr>
       <w:r>
-        <w:rPr>
-          <w:rFonts w:ascii="Aptos" w:hAnsi="Aptos" w:eastAsia="Aptos"/>
-        </w:rPr>
-        <w:t xml:space="preserve">Cost-per-correct is the right lens precisely </w:t>
-      </w:r>
-      <w:r>
-        <w:rPr>
-          <w:rFonts w:ascii="Aptos" w:hAnsi="Aptos" w:eastAsia="Aptos"/>
-          <w:i/>
-        </w:rPr>
-        <w:t>because</w:t>
-      </w:r>
-      <w:r>
-        <w:rPr>
-          <w:rFonts w:ascii="Aptos" w:hAnsi="Aptos" w:eastAsia="Aptos"/>
-        </w:rPr>
-        <w:t xml:space="preserve"> accuracy has saturated: when two models both answer correctly almost always, the deployment decision reduces to what each correct answer costs to produce. On that metric the cheap models do not merely compete - they win outright, and the frontier premium becomes difficult to justify for this vertical.</w:t>
+        <w:t>Cost-per-correct is the right lens precisely because accuracy has saturated, and it is a downstream effect of deployability. A self-hostable model is cheap because it is not paying a frontier provider's serving margin: Gemma 4 31B answers correctly at $0.00071 versus GPT-5.5's $0.084, roughly 117x cheaper, and DeepSeek V4 Pro at $0.0035, roughly 24x cheaper. The gap is not a rounding error in an API bill; it is the difference between expensive at scale and viable to build a product on.</w:t>
       </w:r>
     </w:p>
     <w:p>
@@ -6198,36 +5978,7 @@
         <w:spacing w:after="120"/>
       </w:pPr>
       <w:r>
-        <w:rPr>
-          <w:rFonts w:ascii="Aptos" w:hAnsi="Aptos" w:eastAsia="Aptos"/>
-        </w:rPr>
-        <w:t xml:space="preserve">The one clear exception marks the real floor. </w:t>
-      </w:r>
-      <w:r>
-        <w:rPr>
-          <w:rFonts w:ascii="Aptos" w:hAnsi="Aptos" w:eastAsia="Aptos"/>
-          <w:b/>
-        </w:rPr>
-        <w:t>Llama 4 Maverick (0.861 mean, 0.881 best-of-ladder)</w:t>
-      </w:r>
-      <w:r>
-        <w:rPr>
-          <w:rFonts w:ascii="Aptos" w:hAnsi="Aptos" w:eastAsia="Aptos"/>
-        </w:rPr>
-        <w:t xml:space="preserve"> is the single model that fails to reach the ceiling, and it does so at a level (roughly one part in seven scored below full accuracy) that would be visible to users. This tells us the ceiling is a property of </w:t>
-      </w:r>
-      <w:r>
-        <w:rPr>
-          <w:rFonts w:ascii="Aptos" w:hAnsi="Aptos" w:eastAsia="Aptos"/>
-          <w:i/>
-        </w:rPr>
-        <w:t>capable</w:t>
-      </w:r>
-      <w:r>
-        <w:rPr>
-          <w:rFonts w:ascii="Aptos" w:hAnsi="Aptos" w:eastAsia="Aptos"/>
-        </w:rPr>
-        <w:t xml:space="preserve"> cheap models, not of cheapness as such: below some capability threshold the parity disappears. Gemma 4 31B sits above that threshold; Llama 4 Maverick sits at it.</w:t>
+        <w:t>The one clear exception marks the real floor and shows that deployability is necessary but not sufficient. Llama 4 Maverick (0.861 mean, 0.881 best-of-ladder) is itself open-weight and single-node-capable, yet lands clearly behind the other three. Self-hostability alone does not guarantee accuracy; the operative rule is the cheapest, most deployable model that still clears your accuracy floor. That Llama lags also confirms the benchmark can still discriminate a genuinely weaker model.</w:t>
       </w:r>
     </w:p>
     <w:p>
@@ -6267,7 +6018,7 @@
         <w:pStyle w:val="Heading2"/>
       </w:pPr>
       <w:r>
-        <w:t>5.4 Implications: cheap models per vertical, as skills</w:t>
+        <w:t>5.4 You don't need a closed model you can't run yourself</w:t>
       </w:r>
     </w:p>
     <w:p>
@@ -6276,21 +6027,7 @@
         <w:spacing w:after="120"/>
       </w:pPr>
       <w:r>
-        <w:rPr>
-          <w:rFonts w:ascii="Aptos" w:hAnsi="Aptos" w:eastAsia="Aptos"/>
-        </w:rPr>
-        <w:t>Taken together, these results argue for a specific deployment pattern. For a bounded academic vertical - here, standard first-year undergraduate STEM in Hebrew RTL - the pragmatic recipe is a capable cheap model paired with a concise distilled vertical prompt, deployed as a reusable skill. This captures the accuracy of the frontier (within CI) at a fraction of the cost, while the concise prompt is intended to reduce exposure to the length-driven degradation risk that would make a naive "just give the small model the big prompt" strategy backfire.</w:t>
-      </w:r>
-      <w:r>
-        <w:rPr>
-          <w:rFonts w:ascii="Aptos" w:hAnsi="Aptos" w:eastAsia="Aptos"/>
-          <w:b/>
-        </w:rPr>
-      </w:r>
-      <w:r>
-        <w:rPr>
-          <w:rFonts w:ascii="Aptos" w:hAnsi="Aptos" w:eastAsia="Aptos"/>
-        </w:rPr>
+        <w:t>Taken together, these results argue for a specific deployment pattern for bounded verticals: pair a capable open-weight model you can self-host with retrieval grounding and a short, vertical-specific prompt, and deploy it as a reusable, per-vertical skill. This captures the frontier's accuracy (within CI) on hardware you own, at a fraction of the cost, without routing your data and your product's differentiation through a system controlled by whichever lab is ahead this quarter.</w:t>
       </w:r>
     </w:p>
     <w:p>
@@ -6299,23 +6036,7 @@
         <w:spacing w:after="120"/>
       </w:pPr>
       <w:r>
-        <w:rPr>
-          <w:rFonts w:ascii="Aptos" w:hAnsi="Aptos" w:eastAsia="Aptos"/>
-        </w:rPr>
-        <w:t xml:space="preserve">The broader implication is blunt: on this corpus, for </w:t>
-      </w:r>
-      <w:r>
-        <w:rPr>
-          <w:rFonts w:ascii="Aptos" w:hAnsi="Aptos" w:eastAsia="Aptos"/>
-          <w:i/>
-        </w:rPr>
-        <w:t>answerable-from-source</w:t>
-      </w:r>
-      <w:r>
-        <w:rPr>
-          <w:rFonts w:ascii="Aptos" w:hAnsi="Aptos" w:eastAsia="Aptos"/>
-        </w:rPr>
-        <w:t xml:space="preserve"> STEM, the frontier gap is not the deployment bottleneck. The differentiator among 2026 models on this class of task is no longer whether they can solve the problem but what solving it costs - and that shifts the design question from "which is the strongest model" to "which is the cheapest model above the capability floor, wrapped in a prompt that is short enough not to hurt it." That is a per-vertical, skill-shaped answer, and it is cheap: the entire study cost $16.50 in metered API usage.</w:t>
+        <w:t>The concern is not hypothetical. On CNBC's Squawk Box on July 1, 2026, Palantir CEO Alex Karp argued that AI providers are imposing a wealth tax on businesses, charging heavily for tokens while harvesting the proprietary data those businesses feed in to improve the providers' own models. His framing targets large enterprises, but the same logic applies to any product built as a thin layer over a closed model: the owner of that model has both visibility into your usage and the incentive to fold your differentiating feature into the base model. A moat built entirely on a rented, closed foundation is not a moat you control. For a well-scoped vertical, this benchmark is one small piece of evidence that you may not need to accept that arrangement: an open-weight model plus grounding plus a short vertical prompt closes most of the gap on infrastructure you own.</w:t>
       </w:r>
     </w:p>
     <w:p>
@@ -6493,10 +6214,7 @@
         <w:spacing w:after="120"/>
       </w:pPr>
       <w:r>
-        <w:rPr>
-          <w:rFonts w:ascii="Aptos" w:hAnsi="Aptos" w:eastAsia="Aptos"/>
-        </w:rPr>
-        <w:t>We evaluated eight models across three levels of a distilled vertical prompt, in zero-shot and RAG conditions, on a balanced set of hard multi-part Hebrew RTL STEM questions - 720 cells in all, blind-graded against an accuracy-first rubric. The result is a clean, honest, two-part finding.</w:t>
+        <w:t>We evaluated eight models across three levels of a distilled vertical prompt, in zero-shot and RAG conditions, on an original, self-contained Hebrew (RTL) STEM benchmark: 720 blind-graded answers, at temperature 0, for a total metered cost of $16.50. Three findings stand out.</w:t>
       </w:r>
     </w:p>
     <w:p>
@@ -6505,23 +6223,7 @@
         <w:spacing w:after="120"/>
       </w:pPr>
       <w:r>
-        <w:rPr>
-          <w:rFonts w:ascii="Aptos" w:hAnsi="Aptos" w:eastAsia="Aptos"/>
-        </w:rPr>
-        <w:t xml:space="preserve">First, </w:t>
-      </w:r>
-      <w:r>
-        <w:rPr>
-          <w:rFonts w:ascii="Aptos" w:hAnsi="Aptos" w:eastAsia="Aptos"/>
-          <w:b/>
-        </w:rPr>
-        <w:t>cheap models already match frontier accuracy</w:t>
-      </w:r>
-      <w:r>
-        <w:rPr>
-          <w:rFonts w:ascii="Aptos" w:hAnsi="Aptos" w:eastAsia="Aptos"/>
-        </w:rPr>
-        <w:t xml:space="preserve"> on STEM problems that are answerable from their source. A Tier-3 open-weights model reaches the frontier best-of-ladder ceiling at roughly 117x lower cost per correct answer than a flagship; a second matches it at ~24x lower cost. The frontier premium, on this vertical, buys almost nothing in accuracy.</w:t>
+        <w:t>First, on STEM problems answerable from the supplied source, cheap open-weight models already match a closed frontier model's accuracy: DeepSeek V4 Pro (0.993) and Gemma 4 31B (0.987) sit within noise of GPT-5.5 and Opus 4.8 (both 1.000).</w:t>
       </w:r>
     </w:p>
     <w:p>
@@ -6530,21 +6232,7 @@
         <w:spacing w:after="120"/>
       </w:pPr>
       <w:r>
-        <w:rPr>
-          <w:rFonts w:ascii="Aptos" w:hAnsi="Aptos" w:eastAsia="Aptos"/>
-        </w:rPr>
-        <w:t>Second, the concise distilled vertical prompt neither helps nor hurts at ceiling - and that is its virtue. On a near-saturated task there is no accuracy to add, but the short prompt also does not show the degradation pattern that motivates avoiding very long, crowded prompts. It carries the reasoning scaffolding and error checklist of a long prompt without entering the length regime this paper is trying to avoid. The concise vertical prompt is thus the pragmatic, low-risk deployment recipe: it captures frontier-quality behavior on a bounded vertical, at cheap-model cost, without showing a length-driven collapse in this test.</w:t>
-      </w:r>
-      <w:r>
-        <w:rPr>
-          <w:rFonts w:ascii="Aptos" w:hAnsi="Aptos" w:eastAsia="Aptos"/>
-          <w:b/>
-        </w:rPr>
-      </w:r>
-      <w:r>
-        <w:rPr>
-          <w:rFonts w:ascii="Aptos" w:hAnsi="Aptos" w:eastAsia="Aptos"/>
-        </w:rPr>
+        <w:t>Second, the deciding difference is deployability, not capability. Three of the four models compared are open-weight and self-hostable on a single node you control, from a consumer GPU to a datacenter server, while the closed frontier model cannot be self-hosted at all. The 24 to 117x lower cost per correct answer is a consequence of running models you own rather than renting a closed API.</w:t>
       </w:r>
     </w:p>
     <w:p>
@@ -6553,23 +6241,7 @@
         <w:spacing w:after="120"/>
       </w:pPr>
       <w:r>
-        <w:rPr>
-          <w:rFonts w:ascii="Aptos" w:hAnsi="Aptos" w:eastAsia="Aptos"/>
-        </w:rPr>
-        <w:t xml:space="preserve">We make no claim of prompt-driven accuracy gains - the data show lift ~ 0, and we report it as such. What the data </w:t>
-      </w:r>
-      <w:r>
-        <w:rPr>
-          <w:rFonts w:ascii="Aptos" w:hAnsi="Aptos" w:eastAsia="Aptos"/>
-          <w:i/>
-        </w:rPr>
-        <w:t>do</w:t>
-      </w:r>
-      <w:r>
-        <w:rPr>
-          <w:rFonts w:ascii="Aptos" w:hAnsi="Aptos" w:eastAsia="Aptos"/>
-        </w:rPr>
-        <w:t xml:space="preserve"> support is a deployment thesis: for answerable-from-source academic STEM, pair a capable cheap model with a concise distilled prompt, ship it as a per-vertical skill, and spend the two orders of magnitude you save elsewhere. The open question we hand to future work is where that parity breaks - on harder, less self-contained, adversarial items, and under a direct long-versus-concise prompt-length comparison that we deliberately left untested here.</w:t>
+        <w:t>Third, the steering levers behaved honestly: retrieval gave a small, reliable, non-negative lift, and the concise distilled prompt neither helped nor hurt at the ceiling, a good low-risk wrapper rather than an accuracy lever. We make no claim of prompt-driven accuracy gains. The takeaway for building on a bounded vertical is blunt: stop asking which model is smartest and start asking which model you can run yourself that still clears your accuracy floor, because on this evidence, for answerable-from-source STEM, that model is not a closed one.</w:t>
       </w:r>
     </w:p>
     <w:p>
@@ -7008,7 +6680,7 @@
       <w:rPr>
         <w:sz w:val="16"/>
       </w:rPr>
-      <w:t>Distilled Vertical Prompts - Independent research report (v1.0)</w:t>
+      <w:t>Distilled Vertical Prompts - Independent research report</w:t>
     </w:r>
   </w:p>
 </w:ftr>

</xml_diff>